<commit_message>
YouTube destek sistemi: ogrenci seviyesine gore otomatik kanal ve ders yonlendirmesi eklendi
- core/youtube_recommender.py: 6 brans icin temel, orta ve ileri duzey YouTube kanal katalogu ve pedagojik calisma taktikleri olusturuldu.
- core/student_card_gen.py: 27 ogrencinin resmi Word karnelerine brans ve net bazli YouTube kanali, calisma odagi ve calisma taktikleri eklendi.
- app.py: Ogrenci ve ogretmen paneline tiklanabilir dogrudan YouTube konu arama linkleri, seviye rozetleri ve calisma taktikleri karti eklendi; ogretmen sekmesine toplu YouTube katalogu eklendi.
- exports/: 27 ogrenci karnesi ve tum karneler ZIP paketi guncellendi.
</commit_message>
<xml_diff>
--- a/exports/karneler/117_CAGRIHAN_BENGUL_Karne.docx
+++ b/exports/karneler/117_CAGRIHAN_BENGUL_Karne.docx
@@ -27,7 +27,7 @@
           <w:color w:val="646464"/>
           <w:sz w:val="17"/>
         </w:rPr>
-        <w:t>Deneme Sınavı: 2026-2027  PARAF LGS 1 | Kurumsal Başarı ve Takip Sistemi</w:t>
+        <w:t>Deneme Sınavı: PARAF LGS 1 | Kurumsal Başarı ve Takip Sistemi</w:t>
       </w:r>
     </w:p>
     <w:tbl>
@@ -1732,6 +1732,32 @@
               <w:t>Fen Bilimleri netin: 9.67 (12 Doğru, 7 Yanlış, 1 Boş). Sağlam bir altyapın var ancak 7 yanlış netini aşağı çekmiş. Özellikle 'Mevsimlerin Oluşumu' konusundaki (%43) 21 Haziran/21 Aralık gün dönümleri ve birim alana düşen enerji miktarı şemalarını 3D simülasyonla tekrar etmelisin. Deney sorularında bağımsız değişkeni kenara yaz; haftalık 45 fen sorusu çöz.</w:t>
             </w:r>
           </w:p>
+          <w:p>
+            <w:pPr>
+              <w:spacing w:after="20"/>
+            </w:pPr>
+            <w:r>
+              <w:rPr>
+                <w:b/>
+                <w:color w:val="C0392B"/>
+                <w:sz w:val="15"/>
+              </w:rPr>
+              <w:t xml:space="preserve">📺 Önerilen YouTube Desteği (Orta Seviye): </w:t>
+            </w:r>
+            <w:r>
+              <w:rPr>
+                <w:b/>
+                <w:sz w:val="15"/>
+              </w:rPr>
+              <w:t xml:space="preserve">Kanal: Mehmet Hoca ile Fen | </w:t>
+            </w:r>
+            <w:r>
+              <w:rPr>
+                <w:sz w:val="15"/>
+              </w:rPr>
+              <w:t>Odak: Kazanım Pekiştirme &amp; Deney Analizi. Taktik: Deney sorularındaki bağımsız/bağımlı/kontrol değişkeni çözüm adımlarını birebir uygula.</w:t>
+            </w:r>
+          </w:p>
         </w:tc>
       </w:tr>
     </w:tbl>
@@ -1858,6 +1884,32 @@
                 <w:sz w:val="15"/>
               </w:rPr>
               <w:t>Matematik netin: 6.67 (9 Doğru, 7 Yanlış, 4 Boş). Temel matematik altyapın oluşmuş ancak 7 yanlış ve 4 boş puanını sınırlamış. Kritik açıkların olan [Çarpanlar ve Katlar / Asal Çarpanlar (%25), EBOB-EKOK Problemleri (%57), Üslü İfadeler Temel Kuralları (%25), Aralarında Asal Sayılar (%33)] konularında 'Verilenleri Yaz -&gt; Şemayı Çiz -&gt; Matematiksel Modeli Kur' 3 adımlı protokolünü uygula. Günde en az 20 adet yeni nesil soru çözerek işlem hızını artır.</w:t>
+            </w:r>
+          </w:p>
+          <w:p>
+            <w:pPr>
+              <w:spacing w:after="20"/>
+            </w:pPr>
+            <w:r>
+              <w:rPr>
+                <w:b/>
+                <w:color w:val="C0392B"/>
+                <w:sz w:val="15"/>
+              </w:rPr>
+              <w:t xml:space="preserve">📺 Önerilen YouTube Desteği (Temel Seviye): </w:t>
+            </w:r>
+            <w:r>
+              <w:rPr>
+                <w:b/>
+                <w:sz w:val="15"/>
+              </w:rPr>
+              <w:t xml:space="preserve">Kanal: Partikül Matematik | </w:t>
+            </w:r>
+            <w:r>
+              <w:rPr>
+                <w:sz w:val="15"/>
+              </w:rPr>
+              <w:t>Odak: Temel Kavramlar &amp; Adım Adım Konu Anlatımı. Taktik: Videoyu durdurarak hocayla birlikte işlem yap; temel soru tiplerini not alıp kavrama testlerine geç.</w:t>
             </w:r>
           </w:p>
         </w:tc>
@@ -2007,6 +2059,32 @@
               <w:t>Türkçe branş netin: 12.33 (14 Doğru, 5 Yanlış, 1 Boş). Ortalama üstü bir performans olmakla birlikte 5 yanlış başarı payını törpülemiş. Öncelikli olarak sıfır çektiğin [Tablo ve Grafik Yorumlama, Soru-Cevap] konularındaki kavram ve kuralları tekrar et. Kısmi kayıp yaşadığın [Sözcük ve Sözcük Gruplarında Anlam (%50)] alanlarında metindeki açık kanıtın altını çizerek çöz. Günde 20 paragraf sorusu çöz; iki şık arasında kaldığında işaretleme yapmayıp boş bırak.</w:t>
             </w:r>
           </w:p>
+          <w:p>
+            <w:pPr>
+              <w:spacing w:after="20"/>
+            </w:pPr>
+            <w:r>
+              <w:rPr>
+                <w:b/>
+                <w:color w:val="C0392B"/>
+                <w:sz w:val="15"/>
+              </w:rPr>
+              <w:t xml:space="preserve">📺 Önerilen YouTube Desteği (Orta Seviye): </w:t>
+            </w:r>
+            <w:r>
+              <w:rPr>
+                <w:b/>
+                <w:sz w:val="15"/>
+              </w:rPr>
+              <w:t xml:space="preserve">Kanal: Hız Yayınları - Ebubekir Hoca | </w:t>
+            </w:r>
+            <w:r>
+              <w:rPr>
+                <w:sz w:val="15"/>
+              </w:rPr>
+              <w:t>Odak: Paragraf Taktikleri &amp; Çeldirici Eleme. Taktik: Paragraf sorularında hocanın anahtar kelimeleri ve metin kanıtlarını nasıl çizdiğine dikkat et.</w:t>
+            </w:r>
+          </w:p>
         </w:tc>
       </w:tr>
     </w:tbl>
@@ -2133,6 +2211,32 @@
                 <w:sz w:val="15"/>
               </w:rPr>
               <w:t>İnkılap Tarihi netin: 7.67 (8 Doğru, 1 Yanlış, 1 Boş). Hedeflenen seviyenin altında kalındı (7.67 Net). Pekiştirilmesi gereken [Uyanan Avrupa ve Sarsılan Osmanlı (%67), Mustafa Kemal'in Askerlik Hayatı (%67)] konularında kronoloji tablosu çıkar. Sorularda 'Yalnızca bu bilgiye göre' köklerine dikkat et; metne sadık kal. Haftalık 25 soru çöz.</w:t>
+            </w:r>
+          </w:p>
+          <w:p>
+            <w:pPr>
+              <w:spacing w:after="20"/>
+            </w:pPr>
+            <w:r>
+              <w:rPr>
+                <w:b/>
+                <w:color w:val="C0392B"/>
+                <w:sz w:val="15"/>
+              </w:rPr>
+              <w:t xml:space="preserve">📺 Önerilen YouTube Desteği (Orta Seviye): </w:t>
+            </w:r>
+            <w:r>
+              <w:rPr>
+                <w:b/>
+                <w:sz w:val="15"/>
+              </w:rPr>
+              <w:t xml:space="preserve">Kanal: Sosyal Kale | </w:t>
+            </w:r>
+            <w:r>
+              <w:rPr>
+                <w:sz w:val="15"/>
+              </w:rPr>
+              <w:t>Odak: Soru Çözüm Taktikleri &amp; Neden-Sonuç İlişkisi. Taktik: 'Yalnızca bu bilgiye göre' tarzı sorularda metin dışına çıkmama kuralını pekiştir.</w:t>
             </w:r>
           </w:p>
         </w:tc>
@@ -2282,6 +2386,32 @@
               <w:t>Din Kültürü netin: 3.33 (5 Doğru, 5 Yanlış, 0 Boş). Din Kültürü netin (3.33) potansiyelinin altında. Sıfır çektiğin [İnsanın İradesi ve Kader, Ayet el-Kürsi ve Anlamı, Hz. Musa (A.S.) ve Mücadelesi] konusunu mutlaka tekrar et. Kavram karmaşası yaşanan [Kader Kavramları (Ömür, Ecel, Rızık, Tevekkül) (%67)] alanlarına odaklan. Ömür, ecel, rızık, tevekkül, cüzi/külli irade kavramlarını sözlük kartlarına yazıp ezberle. Ayet-el Kürsi ana fikrine ve yasalara çalış.</w:t>
             </w:r>
           </w:p>
+          <w:p>
+            <w:pPr>
+              <w:spacing w:after="20"/>
+            </w:pPr>
+            <w:r>
+              <w:rPr>
+                <w:b/>
+                <w:color w:val="C0392B"/>
+                <w:sz w:val="15"/>
+              </w:rPr>
+              <w:t xml:space="preserve">📺 Önerilen YouTube Desteği (Temel Seviye): </w:t>
+            </w:r>
+            <w:r>
+              <w:rPr>
+                <w:b/>
+                <w:sz w:val="15"/>
+              </w:rPr>
+              <w:t xml:space="preserve">Kanal: Cebrail Hocam | </w:t>
+            </w:r>
+            <w:r>
+              <w:rPr>
+                <w:sz w:val="15"/>
+              </w:rPr>
+              <w:t>Odak: Kaza-Kader Temel Kavramları &amp; Ayet Mealleri. Taktik: Ömür, ecel, rızık, tevekkül ve yasalar konusunu hocanın kavram tablolarından tekrar et.</w:t>
+            </w:r>
+          </w:p>
         </w:tc>
       </w:tr>
     </w:tbl>
@@ -2427,6 +2557,32 @@
                 <w:sz w:val="15"/>
               </w:rPr>
               <w:t>İngilizce branş netin: 4.67 (6 Doğru, 4 Yanlış, 0 Boş). İngilizce branşında 4.67 net ile hedefin gerisinde kalındı. Sıfır çektiğin [Basit Sorular Sorma (Simple Inquiries)] soru kalıplarını tekrar et. Pekiştirilmesi gereken [Daveti Kabul &amp; Reddetme Kalıpları (%50), Kişisel Özellikler / Sıfatlar (Qualities) (%67)] kalıplarını çalış. Davet etme (Would you like...), kabul/ret ve mazeret kalıplarını ve Friendship sıfatlarını her gün 5 kelime kartıyla çalış. Rastgele işaretleme yapma.</w:t>
+            </w:r>
+          </w:p>
+          <w:p>
+            <w:pPr>
+              <w:spacing w:after="20"/>
+            </w:pPr>
+            <w:r>
+              <w:rPr>
+                <w:b/>
+                <w:color w:val="C0392B"/>
+                <w:sz w:val="15"/>
+              </w:rPr>
+              <w:t xml:space="preserve">📺 Önerilen YouTube Desteği (Temel Seviye): </w:t>
+            </w:r>
+            <w:r>
+              <w:rPr>
+                <w:b/>
+                <w:sz w:val="15"/>
+              </w:rPr>
+              <w:t xml:space="preserve">Kanal: Tonguç Akademi | </w:t>
+            </w:r>
+            <w:r>
+              <w:rPr>
+                <w:sz w:val="15"/>
+              </w:rPr>
+              <w:t>Odak: Temel Kelimeler &amp; Kalıp Cümleler. Taktik: Friendship ünitesi kelimelerini ve Türkçelerini sesli tekrar ederek kelime defterine geçir.</w:t>
             </w:r>
           </w:p>
         </w:tc>

</xml_diff>

<commit_message>
feat: Integrate NARTEST LGS 1 exam, multi-exam comparative analytics, updated 29 student cards, and 1-page landscape branch reports
</commit_message>
<xml_diff>
--- a/exports/karneler/117_CAGRIHAN_BENGUL_Karne.docx
+++ b/exports/karneler/117_CAGRIHAN_BENGUL_Karne.docx
@@ -27,7 +27,7 @@
           <w:color w:val="646464"/>
           <w:sz w:val="17"/>
         </w:rPr>
-        <w:t>Deneme Sınavı: PARAF LGS 1 | Kurumsal Başarı ve Takip Sistemi</w:t>
+        <w:t>Deneme Sınavı: 2026-2027  NARTEST LGS 1 | Kurumsal Başarı ve Takip Sistemi</w:t>
       </w:r>
     </w:p>
     <w:tbl>
@@ -169,7 +169,7 @@
               <w:rPr>
                 <w:sz w:val="16"/>
               </w:rPr>
-              <w:t>44.34 Net / 333.71 Puan</w:t>
+              <w:t>66.99 Net / 413.83 Puan</w:t>
             </w:r>
           </w:p>
         </w:tc>
@@ -209,7 +209,7 @@
               <w:rPr>
                 <w:sz w:val="16"/>
               </w:rPr>
-              <w:t>Sınıf: 9/27 | Okul: 39/110 | TG: 6353 (Dilim: %61.35)</w:t>
+              <w:t>Sınıf: 7 / 28 | Okul: 14 / 56 | TG: 1179 (Dilim: %38.68)</w:t>
             </w:r>
           </w:p>
         </w:tc>
@@ -483,7 +483,7 @@
               <w:rPr>
                 <w:sz w:val="15"/>
               </w:rPr>
-              <w:t>14</w:t>
+              <w:t>16</w:t>
             </w:r>
           </w:p>
         </w:tc>
@@ -505,7 +505,7 @@
               <w:rPr>
                 <w:sz w:val="15"/>
               </w:rPr>
-              <w:t>5</w:t>
+              <w:t>3</w:t>
             </w:r>
           </w:p>
         </w:tc>
@@ -549,7 +549,7 @@
               <w:rPr>
                 <w:sz w:val="15"/>
               </w:rPr>
-              <w:t>12.33</w:t>
+              <w:t>15.00</w:t>
             </w:r>
           </w:p>
         </w:tc>
@@ -571,7 +571,7 @@
               <w:rPr>
                 <w:sz w:val="15"/>
               </w:rPr>
-              <w:t>%61.7</w:t>
+              <w:t>%75.0</w:t>
             </w:r>
           </w:p>
         </w:tc>
@@ -639,7 +639,7 @@
               <w:rPr>
                 <w:sz w:val="15"/>
               </w:rPr>
-              <w:t>8</w:t>
+              <w:t>7</w:t>
             </w:r>
           </w:p>
         </w:tc>
@@ -661,7 +661,7 @@
               <w:rPr>
                 <w:sz w:val="15"/>
               </w:rPr>
-              <w:t>1</w:t>
+              <w:t>3</w:t>
             </w:r>
           </w:p>
         </w:tc>
@@ -683,7 +683,7 @@
               <w:rPr>
                 <w:sz w:val="15"/>
               </w:rPr>
-              <w:t>1</w:t>
+              <w:t>0</w:t>
             </w:r>
           </w:p>
         </w:tc>
@@ -705,7 +705,7 @@
               <w:rPr>
                 <w:sz w:val="15"/>
               </w:rPr>
-              <w:t>7.67</w:t>
+              <w:t>6.00</w:t>
             </w:r>
           </w:p>
         </w:tc>
@@ -727,7 +727,7 @@
               <w:rPr>
                 <w:sz w:val="15"/>
               </w:rPr>
-              <w:t>%76.7</w:t>
+              <w:t>%60.0</w:t>
             </w:r>
           </w:p>
         </w:tc>
@@ -795,29 +795,7 @@
               <w:rPr>
                 <w:sz w:val="15"/>
               </w:rPr>
-              <w:t>5</w:t>
-            </w:r>
-          </w:p>
-        </w:tc>
-        <w:tc>
-          <w:tcPr>
-            <w:tcW w:type="dxa" w:w="1543"/>
-            <w:tcMar>
-              <w:top w:w="20" w:type="dxa"/>
-              <w:bottom w:w="20" w:type="dxa"/>
-              <w:left w:w="35" w:type="dxa"/>
-              <w:right w:w="35" w:type="dxa"/>
-            </w:tcMar>
-          </w:tcPr>
-          <w:p>
-            <w:pPr>
-              <w:jc w:val="center"/>
-            </w:pPr>
-            <w:r>
-              <w:rPr>
-                <w:sz w:val="15"/>
-              </w:rPr>
-              <w:t>5</w:t>
+              <w:t>10</w:t>
             </w:r>
           </w:p>
         </w:tc>
@@ -861,7 +839,7 @@
               <w:rPr>
                 <w:sz w:val="15"/>
               </w:rPr>
-              <w:t>3.33</w:t>
+              <w:t>0</w:t>
             </w:r>
           </w:p>
         </w:tc>
@@ -883,7 +861,29 @@
               <w:rPr>
                 <w:sz w:val="15"/>
               </w:rPr>
-              <w:t>%33.3</w:t>
+              <w:t>10.00</w:t>
+            </w:r>
+          </w:p>
+        </w:tc>
+        <w:tc>
+          <w:tcPr>
+            <w:tcW w:type="dxa" w:w="1543"/>
+            <w:tcMar>
+              <w:top w:w="20" w:type="dxa"/>
+              <w:bottom w:w="20" w:type="dxa"/>
+              <w:left w:w="35" w:type="dxa"/>
+              <w:right w:w="35" w:type="dxa"/>
+            </w:tcMar>
+          </w:tcPr>
+          <w:p>
+            <w:pPr>
+              <w:jc w:val="center"/>
+            </w:pPr>
+            <w:r>
+              <w:rPr>
+                <w:sz w:val="15"/>
+              </w:rPr>
+              <w:t>%100.0</w:t>
             </w:r>
           </w:p>
         </w:tc>
@@ -951,7 +951,7 @@
               <w:rPr>
                 <w:sz w:val="15"/>
               </w:rPr>
-              <w:t>6</w:t>
+              <w:t>8</w:t>
             </w:r>
           </w:p>
         </w:tc>
@@ -973,7 +973,7 @@
               <w:rPr>
                 <w:sz w:val="15"/>
               </w:rPr>
-              <w:t>4</w:t>
+              <w:t>2</w:t>
             </w:r>
           </w:p>
         </w:tc>
@@ -1017,7 +1017,7 @@
               <w:rPr>
                 <w:sz w:val="15"/>
               </w:rPr>
-              <w:t>4.67</w:t>
+              <w:t>7.33</w:t>
             </w:r>
           </w:p>
         </w:tc>
@@ -1039,7 +1039,7 @@
               <w:rPr>
                 <w:sz w:val="15"/>
               </w:rPr>
-              <w:t>%46.7</w:t>
+              <w:t>%73.3</w:t>
             </w:r>
           </w:p>
         </w:tc>
@@ -1107,7 +1107,7 @@
               <w:rPr>
                 <w:sz w:val="15"/>
               </w:rPr>
-              <w:t>9</w:t>
+              <w:t>13</w:t>
             </w:r>
           </w:p>
         </w:tc>
@@ -1129,7 +1129,7 @@
               <w:rPr>
                 <w:sz w:val="15"/>
               </w:rPr>
-              <w:t>7</w:t>
+              <w:t>5</w:t>
             </w:r>
           </w:p>
         </w:tc>
@@ -1151,7 +1151,7 @@
               <w:rPr>
                 <w:sz w:val="15"/>
               </w:rPr>
-              <w:t>4</w:t>
+              <w:t>2</w:t>
             </w:r>
           </w:p>
         </w:tc>
@@ -1173,7 +1173,7 @@
               <w:rPr>
                 <w:sz w:val="15"/>
               </w:rPr>
-              <w:t>6.67</w:t>
+              <w:t>11.33</w:t>
             </w:r>
           </w:p>
         </w:tc>
@@ -1195,7 +1195,7 @@
               <w:rPr>
                 <w:sz w:val="15"/>
               </w:rPr>
-              <w:t>%33.4</w:t>
+              <w:t>%56.6</w:t>
             </w:r>
           </w:p>
         </w:tc>
@@ -1263,7 +1263,7 @@
               <w:rPr>
                 <w:sz w:val="15"/>
               </w:rPr>
-              <w:t>12</w:t>
+              <w:t>18</w:t>
             </w:r>
           </w:p>
         </w:tc>
@@ -1285,7 +1285,7 @@
               <w:rPr>
                 <w:sz w:val="15"/>
               </w:rPr>
-              <w:t>7</w:t>
+              <w:t>2</w:t>
             </w:r>
           </w:p>
         </w:tc>
@@ -1307,7 +1307,7 @@
               <w:rPr>
                 <w:sz w:val="15"/>
               </w:rPr>
-              <w:t>1</w:t>
+              <w:t>0</w:t>
             </w:r>
           </w:p>
         </w:tc>
@@ -1329,7 +1329,7 @@
               <w:rPr>
                 <w:sz w:val="15"/>
               </w:rPr>
-              <w:t>9.67</w:t>
+              <w:t>17.33</w:t>
             </w:r>
           </w:p>
         </w:tc>
@@ -1351,7 +1351,7 @@
               <w:rPr>
                 <w:sz w:val="15"/>
               </w:rPr>
-              <w:t>%48.4</w:t>
+              <w:t>%86.6</w:t>
             </w:r>
           </w:p>
         </w:tc>
@@ -1425,7 +1425,7 @@
                 <w:b/>
                 <w:sz w:val="15"/>
               </w:rPr>
-              <w:t>54</w:t>
+              <w:t>72</w:t>
             </w:r>
           </w:p>
         </w:tc>
@@ -1449,7 +1449,7 @@
                 <w:b/>
                 <w:sz w:val="15"/>
               </w:rPr>
-              <w:t>29</w:t>
+              <w:t>15</w:t>
             </w:r>
           </w:p>
         </w:tc>
@@ -1473,7 +1473,7 @@
                 <w:b/>
                 <w:sz w:val="15"/>
               </w:rPr>
-              <w:t>7</w:t>
+              <w:t>3</w:t>
             </w:r>
           </w:p>
         </w:tc>
@@ -1497,7 +1497,7 @@
                 <w:b/>
                 <w:sz w:val="15"/>
               </w:rPr>
-              <w:t>44.34</w:t>
+              <w:t>66.99</w:t>
             </w:r>
           </w:p>
         </w:tc>
@@ -1521,7 +1521,629 @@
                 <w:b/>
                 <w:sz w:val="15"/>
               </w:rPr>
-              <w:t>%49.3</w:t>
+              <w:t>%74.4</w:t>
+            </w:r>
+          </w:p>
+        </w:tc>
+      </w:tr>
+    </w:tbl>
+    <w:p>
+      <w:pPr>
+        <w:spacing w:before="80" w:after="40"/>
+      </w:pPr>
+      <w:r>
+        <w:rPr>
+          <w:b/>
+          <w:color w:val="1F497D"/>
+          <w:sz w:val="18"/>
+        </w:rPr>
+        <w:t>1. DENEMELER ARASI GELİŞİM VE AKADEMİK DEĞİŞİM ANALİZİ (PARAF 1 ➔ NARTEST 1)</w:t>
+      </w:r>
+    </w:p>
+    <w:tbl>
+      <w:tblPr>
+        <w:tblW w:type="auto" w:w="0"/>
+        <w:jc w:val="center"/>
+        <w:tblLook w:firstColumn="1" w:firstRow="1" w:lastColumn="0" w:lastRow="0" w:noHBand="0" w:noVBand="1" w:val="04A0"/>
+        <w:tblBorders>
+          <w:top w:val="single" w:sz="4" w:space="0" w:color="B0C4DE"/>
+          <w:left w:val="single" w:sz="4" w:space="0" w:color="B0C4DE"/>
+          <w:bottom w:val="single" w:sz="4" w:space="0" w:color="B0C4DE"/>
+          <w:right w:val="single" w:sz="4" w:space="0" w:color="B0C4DE"/>
+          <w:insideH w:val="single" w:sz="4" w:space="0" w:color="B0C4DE"/>
+          <w:insideV w:val="single" w:sz="4" w:space="0" w:color="B0C4DE"/>
+        </w:tblBorders>
+      </w:tblPr>
+      <w:tblGrid>
+        <w:gridCol w:w="2160"/>
+        <w:gridCol w:w="2160"/>
+        <w:gridCol w:w="2160"/>
+        <w:gridCol w:w="2160"/>
+        <w:gridCol w:w="2160"/>
+      </w:tblGrid>
+      <w:tr>
+        <w:tc>
+          <w:tcPr>
+            <w:tcW w:type="dxa" w:w="2160"/>
+            <w:shd w:fill="1F497D"/>
+            <w:tcMar>
+              <w:top w:w="25" w:type="dxa"/>
+              <w:bottom w:w="25" w:type="dxa"/>
+              <w:left w:w="35" w:type="dxa"/>
+              <w:right w:w="35" w:type="dxa"/>
+            </w:tcMar>
+          </w:tcPr>
+          <w:p>
+            <w:pPr>
+              <w:jc w:val="left"/>
+            </w:pPr>
+            <w:r>
+              <w:rPr>
+                <w:b/>
+                <w:color w:val="FFFFFF"/>
+                <w:sz w:val="15"/>
+              </w:rPr>
+              <w:t>Değerlendirme Kriteri</w:t>
+            </w:r>
+          </w:p>
+        </w:tc>
+        <w:tc>
+          <w:tcPr>
+            <w:tcW w:type="dxa" w:w="2160"/>
+            <w:shd w:fill="1F497D"/>
+            <w:tcMar>
+              <w:top w:w="25" w:type="dxa"/>
+              <w:bottom w:w="25" w:type="dxa"/>
+              <w:left w:w="35" w:type="dxa"/>
+              <w:right w:w="35" w:type="dxa"/>
+            </w:tcMar>
+          </w:tcPr>
+          <w:p>
+            <w:pPr>
+              <w:jc w:val="center"/>
+            </w:pPr>
+            <w:r>
+              <w:rPr>
+                <w:b/>
+                <w:color w:val="FFFFFF"/>
+                <w:sz w:val="15"/>
+              </w:rPr>
+              <w:t>1. Deneme (PARAF)</w:t>
+            </w:r>
+          </w:p>
+        </w:tc>
+        <w:tc>
+          <w:tcPr>
+            <w:tcW w:type="dxa" w:w="2160"/>
+            <w:shd w:fill="1F497D"/>
+            <w:tcMar>
+              <w:top w:w="25" w:type="dxa"/>
+              <w:bottom w:w="25" w:type="dxa"/>
+              <w:left w:w="35" w:type="dxa"/>
+              <w:right w:w="35" w:type="dxa"/>
+            </w:tcMar>
+          </w:tcPr>
+          <w:p>
+            <w:pPr>
+              <w:jc w:val="center"/>
+            </w:pPr>
+            <w:r>
+              <w:rPr>
+                <w:b/>
+                <w:color w:val="FFFFFF"/>
+                <w:sz w:val="15"/>
+              </w:rPr>
+              <w:t>2. Deneme (NARTEST)</w:t>
+            </w:r>
+          </w:p>
+        </w:tc>
+        <w:tc>
+          <w:tcPr>
+            <w:tcW w:type="dxa" w:w="2160"/>
+            <w:shd w:fill="1F497D"/>
+            <w:tcMar>
+              <w:top w:w="25" w:type="dxa"/>
+              <w:bottom w:w="25" w:type="dxa"/>
+              <w:left w:w="35" w:type="dxa"/>
+              <w:right w:w="35" w:type="dxa"/>
+            </w:tcMar>
+          </w:tcPr>
+          <w:p>
+            <w:pPr>
+              <w:jc w:val="center"/>
+            </w:pPr>
+            <w:r>
+              <w:rPr>
+                <w:b/>
+                <w:color w:val="FFFFFF"/>
+                <w:sz w:val="15"/>
+              </w:rPr>
+              <w:t>Sınavlar Arası Fark</w:t>
+            </w:r>
+          </w:p>
+        </w:tc>
+        <w:tc>
+          <w:tcPr>
+            <w:tcW w:type="dxa" w:w="2160"/>
+            <w:shd w:fill="1F497D"/>
+            <w:tcMar>
+              <w:top w:w="25" w:type="dxa"/>
+              <w:bottom w:w="25" w:type="dxa"/>
+              <w:left w:w="35" w:type="dxa"/>
+              <w:right w:w="35" w:type="dxa"/>
+            </w:tcMar>
+          </w:tcPr>
+          <w:p>
+            <w:pPr>
+              <w:jc w:val="center"/>
+            </w:pPr>
+            <w:r>
+              <w:rPr>
+                <w:b/>
+                <w:color w:val="FFFFFF"/>
+                <w:sz w:val="15"/>
+              </w:rPr>
+              <w:t>Gelişim Durumu</w:t>
+            </w:r>
+          </w:p>
+        </w:tc>
+      </w:tr>
+      <w:tr>
+        <w:tc>
+          <w:tcPr>
+            <w:tcW w:type="dxa" w:w="2160"/>
+            <w:tcMar>
+              <w:top w:w="20" w:type="dxa"/>
+              <w:bottom w:w="20" w:type="dxa"/>
+              <w:left w:w="35" w:type="dxa"/>
+              <w:right w:w="35" w:type="dxa"/>
+            </w:tcMar>
+            <w:shd w:fill="F0F4F8"/>
+          </w:tcPr>
+          <w:p>
+            <w:pPr>
+              <w:jc w:val="left"/>
+            </w:pPr>
+            <w:r>
+              <w:rPr>
+                <w:sz w:val="15"/>
+              </w:rPr>
+              <w:t>Toplam Net</w:t>
+            </w:r>
+          </w:p>
+        </w:tc>
+        <w:tc>
+          <w:tcPr>
+            <w:tcW w:type="dxa" w:w="2160"/>
+            <w:tcMar>
+              <w:top w:w="20" w:type="dxa"/>
+              <w:bottom w:w="20" w:type="dxa"/>
+              <w:left w:w="35" w:type="dxa"/>
+              <w:right w:w="35" w:type="dxa"/>
+            </w:tcMar>
+            <w:shd w:fill="F0F4F8"/>
+          </w:tcPr>
+          <w:p>
+            <w:pPr>
+              <w:jc w:val="center"/>
+            </w:pPr>
+            <w:r>
+              <w:rPr>
+                <w:sz w:val="15"/>
+              </w:rPr>
+              <w:t>44.34 Net</w:t>
+            </w:r>
+          </w:p>
+        </w:tc>
+        <w:tc>
+          <w:tcPr>
+            <w:tcW w:type="dxa" w:w="2160"/>
+            <w:tcMar>
+              <w:top w:w="20" w:type="dxa"/>
+              <w:bottom w:w="20" w:type="dxa"/>
+              <w:left w:w="35" w:type="dxa"/>
+              <w:right w:w="35" w:type="dxa"/>
+            </w:tcMar>
+            <w:shd w:fill="F0F4F8"/>
+          </w:tcPr>
+          <w:p>
+            <w:pPr>
+              <w:jc w:val="center"/>
+            </w:pPr>
+            <w:r>
+              <w:rPr>
+                <w:sz w:val="15"/>
+              </w:rPr>
+              <w:t>66.99 Net</w:t>
+            </w:r>
+          </w:p>
+        </w:tc>
+        <w:tc>
+          <w:tcPr>
+            <w:tcW w:type="dxa" w:w="2160"/>
+            <w:tcMar>
+              <w:top w:w="20" w:type="dxa"/>
+              <w:bottom w:w="20" w:type="dxa"/>
+              <w:left w:w="35" w:type="dxa"/>
+              <w:right w:w="35" w:type="dxa"/>
+            </w:tcMar>
+            <w:shd w:fill="E8F8F5"/>
+          </w:tcPr>
+          <w:p>
+            <w:pPr>
+              <w:jc w:val="center"/>
+            </w:pPr>
+            <w:r>
+              <w:rPr>
+                <w:b/>
+                <w:sz w:val="15"/>
+              </w:rPr>
+              <w:t>+22.65 Net</w:t>
+            </w:r>
+          </w:p>
+        </w:tc>
+        <w:tc>
+          <w:tcPr>
+            <w:tcW w:type="dxa" w:w="2160"/>
+            <w:tcMar>
+              <w:top w:w="20" w:type="dxa"/>
+              <w:bottom w:w="20" w:type="dxa"/>
+              <w:left w:w="35" w:type="dxa"/>
+              <w:right w:w="35" w:type="dxa"/>
+            </w:tcMar>
+            <w:shd w:fill="F0F4F8"/>
+          </w:tcPr>
+          <w:p>
+            <w:pPr>
+              <w:jc w:val="center"/>
+            </w:pPr>
+            <w:r>
+              <w:rPr>
+                <w:sz w:val="15"/>
+              </w:rPr>
+              <w:t>🚀 Çok Güçlü İlerleme</w:t>
+            </w:r>
+          </w:p>
+        </w:tc>
+      </w:tr>
+      <w:tr>
+        <w:tc>
+          <w:tcPr>
+            <w:tcW w:type="dxa" w:w="2160"/>
+            <w:tcMar>
+              <w:top w:w="20" w:type="dxa"/>
+              <w:bottom w:w="20" w:type="dxa"/>
+              <w:left w:w="35" w:type="dxa"/>
+              <w:right w:w="35" w:type="dxa"/>
+            </w:tcMar>
+          </w:tcPr>
+          <w:p>
+            <w:pPr>
+              <w:jc w:val="left"/>
+            </w:pPr>
+            <w:r>
+              <w:rPr>
+                <w:sz w:val="15"/>
+              </w:rPr>
+              <w:t>LGS Puanı</w:t>
+            </w:r>
+          </w:p>
+        </w:tc>
+        <w:tc>
+          <w:tcPr>
+            <w:tcW w:type="dxa" w:w="2160"/>
+            <w:tcMar>
+              <w:top w:w="20" w:type="dxa"/>
+              <w:bottom w:w="20" w:type="dxa"/>
+              <w:left w:w="35" w:type="dxa"/>
+              <w:right w:w="35" w:type="dxa"/>
+            </w:tcMar>
+          </w:tcPr>
+          <w:p>
+            <w:pPr>
+              <w:jc w:val="center"/>
+            </w:pPr>
+            <w:r>
+              <w:rPr>
+                <w:sz w:val="15"/>
+              </w:rPr>
+              <w:t>333.71 Puan</w:t>
+            </w:r>
+          </w:p>
+        </w:tc>
+        <w:tc>
+          <w:tcPr>
+            <w:tcW w:type="dxa" w:w="2160"/>
+            <w:tcMar>
+              <w:top w:w="20" w:type="dxa"/>
+              <w:bottom w:w="20" w:type="dxa"/>
+              <w:left w:w="35" w:type="dxa"/>
+              <w:right w:w="35" w:type="dxa"/>
+            </w:tcMar>
+          </w:tcPr>
+          <w:p>
+            <w:pPr>
+              <w:jc w:val="center"/>
+            </w:pPr>
+            <w:r>
+              <w:rPr>
+                <w:sz w:val="15"/>
+              </w:rPr>
+              <w:t>413.83 Puan</w:t>
+            </w:r>
+          </w:p>
+        </w:tc>
+        <w:tc>
+          <w:tcPr>
+            <w:tcW w:type="dxa" w:w="2160"/>
+            <w:tcMar>
+              <w:top w:w="20" w:type="dxa"/>
+              <w:bottom w:w="20" w:type="dxa"/>
+              <w:left w:w="35" w:type="dxa"/>
+              <w:right w:w="35" w:type="dxa"/>
+            </w:tcMar>
+            <w:shd w:fill="E8F8F5"/>
+          </w:tcPr>
+          <w:p>
+            <w:pPr>
+              <w:jc w:val="center"/>
+            </w:pPr>
+            <w:r>
+              <w:rPr>
+                <w:b/>
+                <w:sz w:val="15"/>
+              </w:rPr>
+              <w:t>+80.12 Puan</w:t>
+            </w:r>
+          </w:p>
+        </w:tc>
+        <w:tc>
+          <w:tcPr>
+            <w:tcW w:type="dxa" w:w="2160"/>
+            <w:tcMar>
+              <w:top w:w="20" w:type="dxa"/>
+              <w:bottom w:w="20" w:type="dxa"/>
+              <w:left w:w="35" w:type="dxa"/>
+              <w:right w:w="35" w:type="dxa"/>
+            </w:tcMar>
+          </w:tcPr>
+          <w:p>
+            <w:pPr>
+              <w:jc w:val="center"/>
+            </w:pPr>
+            <w:r>
+              <w:rPr>
+                <w:sz w:val="15"/>
+              </w:rPr>
+              <w:t>Belirgin Puan Artışı</w:t>
+            </w:r>
+          </w:p>
+        </w:tc>
+      </w:tr>
+      <w:tr>
+        <w:tc>
+          <w:tcPr>
+            <w:tcW w:type="dxa" w:w="2160"/>
+            <w:tcMar>
+              <w:top w:w="20" w:type="dxa"/>
+              <w:bottom w:w="20" w:type="dxa"/>
+              <w:left w:w="35" w:type="dxa"/>
+              <w:right w:w="35" w:type="dxa"/>
+            </w:tcMar>
+          </w:tcPr>
+          <w:p>
+            <w:pPr>
+              <w:jc w:val="left"/>
+            </w:pPr>
+            <w:r>
+              <w:rPr>
+                <w:sz w:val="15"/>
+              </w:rPr>
+              <w:t>Sınıf Derecesi</w:t>
+            </w:r>
+          </w:p>
+        </w:tc>
+        <w:tc>
+          <w:tcPr>
+            <w:tcW w:type="dxa" w:w="2160"/>
+            <w:tcMar>
+              <w:top w:w="20" w:type="dxa"/>
+              <w:bottom w:w="20" w:type="dxa"/>
+              <w:left w:w="35" w:type="dxa"/>
+              <w:right w:w="35" w:type="dxa"/>
+            </w:tcMar>
+          </w:tcPr>
+          <w:p>
+            <w:pPr>
+              <w:jc w:val="center"/>
+            </w:pPr>
+            <w:r>
+              <w:rPr>
+                <w:sz w:val="15"/>
+              </w:rPr>
+              <w:t>9. Sıra / 27</w:t>
+            </w:r>
+          </w:p>
+        </w:tc>
+        <w:tc>
+          <w:tcPr>
+            <w:tcW w:type="dxa" w:w="2160"/>
+            <w:tcMar>
+              <w:top w:w="20" w:type="dxa"/>
+              <w:bottom w:w="20" w:type="dxa"/>
+              <w:left w:w="35" w:type="dxa"/>
+              <w:right w:w="35" w:type="dxa"/>
+            </w:tcMar>
+          </w:tcPr>
+          <w:p>
+            <w:pPr>
+              <w:jc w:val="center"/>
+            </w:pPr>
+            <w:r>
+              <w:rPr>
+                <w:sz w:val="15"/>
+              </w:rPr>
+              <w:t>7. Sıra / 28</w:t>
+            </w:r>
+          </w:p>
+        </w:tc>
+        <w:tc>
+          <w:tcPr>
+            <w:tcW w:type="dxa" w:w="2160"/>
+            <w:tcMar>
+              <w:top w:w="20" w:type="dxa"/>
+              <w:bottom w:w="20" w:type="dxa"/>
+              <w:left w:w="35" w:type="dxa"/>
+              <w:right w:w="35" w:type="dxa"/>
+            </w:tcMar>
+            <w:shd w:fill="E8F8F5"/>
+          </w:tcPr>
+          <w:p>
+            <w:pPr>
+              <w:jc w:val="center"/>
+            </w:pPr>
+            <w:r>
+              <w:rPr>
+                <w:b/>
+                <w:sz w:val="15"/>
+              </w:rPr>
+              <w:t>+2 Sıra Yükseldi</w:t>
+            </w:r>
+          </w:p>
+        </w:tc>
+        <w:tc>
+          <w:tcPr>
+            <w:tcW w:type="dxa" w:w="2160"/>
+            <w:tcMar>
+              <w:top w:w="20" w:type="dxa"/>
+              <w:bottom w:w="20" w:type="dxa"/>
+              <w:left w:w="35" w:type="dxa"/>
+              <w:right w:w="35" w:type="dxa"/>
+            </w:tcMar>
+          </w:tcPr>
+          <w:p>
+            <w:pPr>
+              <w:jc w:val="center"/>
+            </w:pPr>
+            <w:r>
+              <w:rPr>
+                <w:sz w:val="15"/>
+              </w:rPr>
+              <w:t>Sınıf İçi Başarı</w:t>
+            </w:r>
+          </w:p>
+        </w:tc>
+      </w:tr>
+      <w:tr>
+        <w:tc>
+          <w:tcPr>
+            <w:tcW w:type="dxa" w:w="2160"/>
+            <w:tcMar>
+              <w:top w:w="20" w:type="dxa"/>
+              <w:bottom w:w="20" w:type="dxa"/>
+              <w:left w:w="35" w:type="dxa"/>
+              <w:right w:w="35" w:type="dxa"/>
+            </w:tcMar>
+          </w:tcPr>
+          <w:p>
+            <w:pPr>
+              <w:jc w:val="left"/>
+            </w:pPr>
+            <w:r>
+              <w:rPr>
+                <w:sz w:val="15"/>
+              </w:rPr>
+              <w:t>Okul Derecesi</w:t>
+            </w:r>
+          </w:p>
+        </w:tc>
+        <w:tc>
+          <w:tcPr>
+            <w:tcW w:type="dxa" w:w="2160"/>
+            <w:tcMar>
+              <w:top w:w="20" w:type="dxa"/>
+              <w:bottom w:w="20" w:type="dxa"/>
+              <w:left w:w="35" w:type="dxa"/>
+              <w:right w:w="35" w:type="dxa"/>
+            </w:tcMar>
+          </w:tcPr>
+          <w:p>
+            <w:pPr>
+              <w:jc w:val="center"/>
+            </w:pPr>
+            <w:r>
+              <w:rPr>
+                <w:sz w:val="15"/>
+              </w:rPr>
+              <w:t>39. Sıra / 110</w:t>
+            </w:r>
+          </w:p>
+        </w:tc>
+        <w:tc>
+          <w:tcPr>
+            <w:tcW w:type="dxa" w:w="2160"/>
+            <w:tcMar>
+              <w:top w:w="20" w:type="dxa"/>
+              <w:bottom w:w="20" w:type="dxa"/>
+              <w:left w:w="35" w:type="dxa"/>
+              <w:right w:w="35" w:type="dxa"/>
+            </w:tcMar>
+          </w:tcPr>
+          <w:p>
+            <w:pPr>
+              <w:jc w:val="center"/>
+            </w:pPr>
+            <w:r>
+              <w:rPr>
+                <w:sz w:val="15"/>
+              </w:rPr>
+              <w:t>14. Sıra / 56</w:t>
+            </w:r>
+          </w:p>
+        </w:tc>
+        <w:tc>
+          <w:tcPr>
+            <w:tcW w:type="dxa" w:w="2160"/>
+            <w:tcMar>
+              <w:top w:w="20" w:type="dxa"/>
+              <w:bottom w:w="20" w:type="dxa"/>
+              <w:left w:w="35" w:type="dxa"/>
+              <w:right w:w="35" w:type="dxa"/>
+            </w:tcMar>
+            <w:shd w:fill="E8F8F5"/>
+          </w:tcPr>
+          <w:p>
+            <w:pPr>
+              <w:jc w:val="center"/>
+            </w:pPr>
+            <w:r>
+              <w:rPr>
+                <w:b/>
+                <w:sz w:val="15"/>
+              </w:rPr>
+              <w:t>+25 Sıra Yükseldi</w:t>
+            </w:r>
+          </w:p>
+        </w:tc>
+        <w:tc>
+          <w:tcPr>
+            <w:tcW w:type="dxa" w:w="2160"/>
+            <w:tcMar>
+              <w:top w:w="20" w:type="dxa"/>
+              <w:bottom w:w="20" w:type="dxa"/>
+              <w:left w:w="35" w:type="dxa"/>
+              <w:right w:w="35" w:type="dxa"/>
+            </w:tcMar>
+          </w:tcPr>
+          <w:p>
+            <w:pPr>
+              <w:jc w:val="center"/>
+            </w:pPr>
+            <w:r>
+              <w:rPr>
+                <w:sz w:val="15"/>
+              </w:rPr>
+              <w:t>Okul İçi Başarı</w:t>
             </w:r>
           </w:p>
         </w:tc>
@@ -1535,9 +2157,569 @@
         <w:rPr>
           <w:b/>
           <w:color w:val="006666"/>
+          <w:sz w:val="16"/>
+        </w:rPr>
+        <w:t>Branş Bazlı Net Değişim Tablosu:</w:t>
+      </w:r>
+    </w:p>
+    <w:tbl>
+      <w:tblPr>
+        <w:tblW w:type="auto" w:w="0"/>
+        <w:jc w:val="center"/>
+        <w:tblLook w:firstColumn="1" w:firstRow="1" w:lastColumn="0" w:lastRow="0" w:noHBand="0" w:noVBand="1" w:val="04A0"/>
+        <w:tblBorders>
+          <w:top w:val="single" w:sz="4" w:space="0" w:color="B0C4DE"/>
+          <w:left w:val="single" w:sz="4" w:space="0" w:color="B0C4DE"/>
+          <w:bottom w:val="single" w:sz="4" w:space="0" w:color="B0C4DE"/>
+          <w:right w:val="single" w:sz="4" w:space="0" w:color="B0C4DE"/>
+          <w:insideH w:val="single" w:sz="4" w:space="0" w:color="B0C4DE"/>
+          <w:insideV w:val="single" w:sz="4" w:space="0" w:color="B0C4DE"/>
+        </w:tblBorders>
+      </w:tblPr>
+      <w:tblGrid>
+        <w:gridCol w:w="1543"/>
+        <w:gridCol w:w="1543"/>
+        <w:gridCol w:w="1543"/>
+        <w:gridCol w:w="1543"/>
+        <w:gridCol w:w="1543"/>
+        <w:gridCol w:w="1543"/>
+        <w:gridCol w:w="1543"/>
+      </w:tblGrid>
+      <w:tr>
+        <w:tc>
+          <w:tcPr>
+            <w:tcW w:type="dxa" w:w="1543"/>
+            <w:shd w:fill="1F497D"/>
+            <w:tcMar>
+              <w:top w:w="20" w:type="dxa"/>
+              <w:bottom w:w="20" w:type="dxa"/>
+              <w:left w:w="30" w:type="dxa"/>
+              <w:right w:w="30" w:type="dxa"/>
+            </w:tcMar>
+          </w:tcPr>
+          <w:p>
+            <w:pPr>
+              <w:jc w:val="center"/>
+            </w:pPr>
+            <w:r>
+              <w:rPr>
+                <w:b/>
+                <w:color w:val="FFFFFF"/>
+                <w:sz w:val="15"/>
+              </w:rPr>
+              <w:t>Deneme Sınavı</w:t>
+            </w:r>
+          </w:p>
+        </w:tc>
+        <w:tc>
+          <w:tcPr>
+            <w:tcW w:type="dxa" w:w="1543"/>
+            <w:shd w:fill="1F497D"/>
+            <w:tcMar>
+              <w:top w:w="20" w:type="dxa"/>
+              <w:bottom w:w="20" w:type="dxa"/>
+              <w:left w:w="30" w:type="dxa"/>
+              <w:right w:w="30" w:type="dxa"/>
+            </w:tcMar>
+          </w:tcPr>
+          <w:p>
+            <w:pPr>
+              <w:jc w:val="center"/>
+            </w:pPr>
+            <w:r>
+              <w:rPr>
+                <w:b/>
+                <w:color w:val="FFFFFF"/>
+                <w:sz w:val="15"/>
+              </w:rPr>
+              <w:t>Türkçe</w:t>
+            </w:r>
+          </w:p>
+        </w:tc>
+        <w:tc>
+          <w:tcPr>
+            <w:tcW w:type="dxa" w:w="1543"/>
+            <w:shd w:fill="1F497D"/>
+            <w:tcMar>
+              <w:top w:w="20" w:type="dxa"/>
+              <w:bottom w:w="20" w:type="dxa"/>
+              <w:left w:w="30" w:type="dxa"/>
+              <w:right w:w="30" w:type="dxa"/>
+            </w:tcMar>
+          </w:tcPr>
+          <w:p>
+            <w:pPr>
+              <w:jc w:val="center"/>
+            </w:pPr>
+            <w:r>
+              <w:rPr>
+                <w:b/>
+                <w:color w:val="FFFFFF"/>
+                <w:sz w:val="15"/>
+              </w:rPr>
+              <w:t>İnkılap</w:t>
+            </w:r>
+          </w:p>
+        </w:tc>
+        <w:tc>
+          <w:tcPr>
+            <w:tcW w:type="dxa" w:w="1543"/>
+            <w:shd w:fill="1F497D"/>
+            <w:tcMar>
+              <w:top w:w="20" w:type="dxa"/>
+              <w:bottom w:w="20" w:type="dxa"/>
+              <w:left w:w="30" w:type="dxa"/>
+              <w:right w:w="30" w:type="dxa"/>
+            </w:tcMar>
+          </w:tcPr>
+          <w:p>
+            <w:pPr>
+              <w:jc w:val="center"/>
+            </w:pPr>
+            <w:r>
+              <w:rPr>
+                <w:b/>
+                <w:color w:val="FFFFFF"/>
+                <w:sz w:val="15"/>
+              </w:rPr>
+              <w:t>Din Kül.</w:t>
+            </w:r>
+          </w:p>
+        </w:tc>
+        <w:tc>
+          <w:tcPr>
+            <w:tcW w:type="dxa" w:w="1543"/>
+            <w:shd w:fill="1F497D"/>
+            <w:tcMar>
+              <w:top w:w="20" w:type="dxa"/>
+              <w:bottom w:w="20" w:type="dxa"/>
+              <w:left w:w="30" w:type="dxa"/>
+              <w:right w:w="30" w:type="dxa"/>
+            </w:tcMar>
+          </w:tcPr>
+          <w:p>
+            <w:pPr>
+              <w:jc w:val="center"/>
+            </w:pPr>
+            <w:r>
+              <w:rPr>
+                <w:b/>
+                <w:color w:val="FFFFFF"/>
+                <w:sz w:val="15"/>
+              </w:rPr>
+              <w:t>İngilizce</w:t>
+            </w:r>
+          </w:p>
+        </w:tc>
+        <w:tc>
+          <w:tcPr>
+            <w:tcW w:type="dxa" w:w="1543"/>
+            <w:shd w:fill="1F497D"/>
+            <w:tcMar>
+              <w:top w:w="20" w:type="dxa"/>
+              <w:bottom w:w="20" w:type="dxa"/>
+              <w:left w:w="30" w:type="dxa"/>
+              <w:right w:w="30" w:type="dxa"/>
+            </w:tcMar>
+          </w:tcPr>
+          <w:p>
+            <w:pPr>
+              <w:jc w:val="center"/>
+            </w:pPr>
+            <w:r>
+              <w:rPr>
+                <w:b/>
+                <w:color w:val="FFFFFF"/>
+                <w:sz w:val="15"/>
+              </w:rPr>
+              <w:t>Matematik</w:t>
+            </w:r>
+          </w:p>
+        </w:tc>
+        <w:tc>
+          <w:tcPr>
+            <w:tcW w:type="dxa" w:w="1543"/>
+            <w:shd w:fill="1F497D"/>
+            <w:tcMar>
+              <w:top w:w="20" w:type="dxa"/>
+              <w:bottom w:w="20" w:type="dxa"/>
+              <w:left w:w="30" w:type="dxa"/>
+              <w:right w:w="30" w:type="dxa"/>
+            </w:tcMar>
+          </w:tcPr>
+          <w:p>
+            <w:pPr>
+              <w:jc w:val="center"/>
+            </w:pPr>
+            <w:r>
+              <w:rPr>
+                <w:b/>
+                <w:color w:val="FFFFFF"/>
+                <w:sz w:val="15"/>
+              </w:rPr>
+              <w:t>Fen Bil.</w:t>
+            </w:r>
+          </w:p>
+        </w:tc>
+      </w:tr>
+      <w:tr>
+        <w:tc>
+          <w:tcPr>
+            <w:tcW w:type="dxa" w:w="1543"/>
+            <w:tcMar>
+              <w:top w:w="15" w:type="dxa"/>
+              <w:bottom w:w="15" w:type="dxa"/>
+              <w:left w:w="25" w:type="dxa"/>
+              <w:right w:w="25" w:type="dxa"/>
+            </w:tcMar>
+          </w:tcPr>
+          <w:p>
+            <w:pPr>
+              <w:jc w:val="center"/>
+            </w:pPr>
+            <w:r>
+              <w:rPr>
+                <w:sz w:val="15"/>
+              </w:rPr>
+              <w:t>1. PARAF LGS 1</w:t>
+            </w:r>
+          </w:p>
+        </w:tc>
+        <w:tc>
+          <w:tcPr>
+            <w:tcW w:type="dxa" w:w="1543"/>
+            <w:tcMar>
+              <w:top w:w="15" w:type="dxa"/>
+              <w:bottom w:w="15" w:type="dxa"/>
+              <w:left w:w="25" w:type="dxa"/>
+              <w:right w:w="25" w:type="dxa"/>
+            </w:tcMar>
+          </w:tcPr>
+          <w:p>
+            <w:pPr>
+              <w:jc w:val="center"/>
+            </w:pPr>
+            <w:r>
+              <w:rPr>
+                <w:sz w:val="15"/>
+              </w:rPr>
+              <w:t>12.33</w:t>
+            </w:r>
+          </w:p>
+        </w:tc>
+        <w:tc>
+          <w:tcPr>
+            <w:tcW w:type="dxa" w:w="1543"/>
+            <w:tcMar>
+              <w:top w:w="15" w:type="dxa"/>
+              <w:bottom w:w="15" w:type="dxa"/>
+              <w:left w:w="25" w:type="dxa"/>
+              <w:right w:w="25" w:type="dxa"/>
+            </w:tcMar>
+          </w:tcPr>
+          <w:p>
+            <w:pPr>
+              <w:jc w:val="center"/>
+            </w:pPr>
+            <w:r>
+              <w:rPr>
+                <w:sz w:val="15"/>
+              </w:rPr>
+              <w:t>7.67</w:t>
+            </w:r>
+          </w:p>
+        </w:tc>
+        <w:tc>
+          <w:tcPr>
+            <w:tcW w:type="dxa" w:w="1543"/>
+            <w:tcMar>
+              <w:top w:w="15" w:type="dxa"/>
+              <w:bottom w:w="15" w:type="dxa"/>
+              <w:left w:w="25" w:type="dxa"/>
+              <w:right w:w="25" w:type="dxa"/>
+            </w:tcMar>
+          </w:tcPr>
+          <w:p>
+            <w:pPr>
+              <w:jc w:val="center"/>
+            </w:pPr>
+            <w:r>
+              <w:rPr>
+                <w:sz w:val="15"/>
+              </w:rPr>
+              <w:t>3.33</w:t>
+            </w:r>
+          </w:p>
+        </w:tc>
+        <w:tc>
+          <w:tcPr>
+            <w:tcW w:type="dxa" w:w="1543"/>
+            <w:tcMar>
+              <w:top w:w="15" w:type="dxa"/>
+              <w:bottom w:w="15" w:type="dxa"/>
+              <w:left w:w="25" w:type="dxa"/>
+              <w:right w:w="25" w:type="dxa"/>
+            </w:tcMar>
+          </w:tcPr>
+          <w:p>
+            <w:pPr>
+              <w:jc w:val="center"/>
+            </w:pPr>
+            <w:r>
+              <w:rPr>
+                <w:sz w:val="15"/>
+              </w:rPr>
+              <w:t>4.67</w:t>
+            </w:r>
+          </w:p>
+        </w:tc>
+        <w:tc>
+          <w:tcPr>
+            <w:tcW w:type="dxa" w:w="1543"/>
+            <w:tcMar>
+              <w:top w:w="15" w:type="dxa"/>
+              <w:bottom w:w="15" w:type="dxa"/>
+              <w:left w:w="25" w:type="dxa"/>
+              <w:right w:w="25" w:type="dxa"/>
+            </w:tcMar>
+          </w:tcPr>
+          <w:p>
+            <w:pPr>
+              <w:jc w:val="center"/>
+            </w:pPr>
+            <w:r>
+              <w:rPr>
+                <w:sz w:val="15"/>
+              </w:rPr>
+              <w:t>6.67</w:t>
+            </w:r>
+          </w:p>
+        </w:tc>
+        <w:tc>
+          <w:tcPr>
+            <w:tcW w:type="dxa" w:w="1543"/>
+            <w:tcMar>
+              <w:top w:w="15" w:type="dxa"/>
+              <w:bottom w:w="15" w:type="dxa"/>
+              <w:left w:w="25" w:type="dxa"/>
+              <w:right w:w="25" w:type="dxa"/>
+            </w:tcMar>
+          </w:tcPr>
+          <w:p>
+            <w:pPr>
+              <w:jc w:val="center"/>
+            </w:pPr>
+            <w:r>
+              <w:rPr>
+                <w:sz w:val="15"/>
+              </w:rPr>
+              <w:t>9.67</w:t>
+            </w:r>
+          </w:p>
+        </w:tc>
+      </w:tr>
+      <w:tr>
+        <w:tc>
+          <w:tcPr>
+            <w:tcW w:type="dxa" w:w="1543"/>
+            <w:tcMar>
+              <w:top w:w="15" w:type="dxa"/>
+              <w:bottom w:w="15" w:type="dxa"/>
+              <w:left w:w="25" w:type="dxa"/>
+              <w:right w:w="25" w:type="dxa"/>
+            </w:tcMar>
+          </w:tcPr>
+          <w:p>
+            <w:pPr>
+              <w:jc w:val="center"/>
+            </w:pPr>
+            <w:r>
+              <w:rPr>
+                <w:b/>
+                <w:sz w:val="15"/>
+              </w:rPr>
+              <w:t>Net Farkı (+/-)</w:t>
+            </w:r>
+          </w:p>
+        </w:tc>
+        <w:tc>
+          <w:tcPr>
+            <w:tcW w:type="dxa" w:w="1543"/>
+            <w:tcMar>
+              <w:top w:w="15" w:type="dxa"/>
+              <w:bottom w:w="15" w:type="dxa"/>
+              <w:left w:w="25" w:type="dxa"/>
+              <w:right w:w="25" w:type="dxa"/>
+            </w:tcMar>
+            <w:shd w:fill="E8F8F5"/>
+          </w:tcPr>
+          <w:p>
+            <w:pPr>
+              <w:jc w:val="center"/>
+            </w:pPr>
+            <w:r>
+              <w:rPr>
+                <w:b/>
+                <w:sz w:val="15"/>
+              </w:rPr>
+              <w:t>+2.67</w:t>
+            </w:r>
+          </w:p>
+        </w:tc>
+        <w:tc>
+          <w:tcPr>
+            <w:tcW w:type="dxa" w:w="1543"/>
+            <w:tcMar>
+              <w:top w:w="15" w:type="dxa"/>
+              <w:bottom w:w="15" w:type="dxa"/>
+              <w:left w:w="25" w:type="dxa"/>
+              <w:right w:w="25" w:type="dxa"/>
+            </w:tcMar>
+            <w:shd w:fill="FDEDEC"/>
+          </w:tcPr>
+          <w:p>
+            <w:pPr>
+              <w:jc w:val="center"/>
+            </w:pPr>
+            <w:r>
+              <w:rPr>
+                <w:b/>
+                <w:sz w:val="15"/>
+              </w:rPr>
+              <w:t>-1.67</w:t>
+            </w:r>
+          </w:p>
+        </w:tc>
+        <w:tc>
+          <w:tcPr>
+            <w:tcW w:type="dxa" w:w="1543"/>
+            <w:tcMar>
+              <w:top w:w="15" w:type="dxa"/>
+              <w:bottom w:w="15" w:type="dxa"/>
+              <w:left w:w="25" w:type="dxa"/>
+              <w:right w:w="25" w:type="dxa"/>
+            </w:tcMar>
+            <w:shd w:fill="E8F8F5"/>
+          </w:tcPr>
+          <w:p>
+            <w:pPr>
+              <w:jc w:val="center"/>
+            </w:pPr>
+            <w:r>
+              <w:rPr>
+                <w:b/>
+                <w:sz w:val="15"/>
+              </w:rPr>
+              <w:t>+6.67</w:t>
+            </w:r>
+          </w:p>
+        </w:tc>
+        <w:tc>
+          <w:tcPr>
+            <w:tcW w:type="dxa" w:w="1543"/>
+            <w:tcMar>
+              <w:top w:w="15" w:type="dxa"/>
+              <w:bottom w:w="15" w:type="dxa"/>
+              <w:left w:w="25" w:type="dxa"/>
+              <w:right w:w="25" w:type="dxa"/>
+            </w:tcMar>
+            <w:shd w:fill="E8F8F5"/>
+          </w:tcPr>
+          <w:p>
+            <w:pPr>
+              <w:jc w:val="center"/>
+            </w:pPr>
+            <w:r>
+              <w:rPr>
+                <w:b/>
+                <w:sz w:val="15"/>
+              </w:rPr>
+              <w:t>+2.66</w:t>
+            </w:r>
+          </w:p>
+        </w:tc>
+        <w:tc>
+          <w:tcPr>
+            <w:tcW w:type="dxa" w:w="1543"/>
+            <w:tcMar>
+              <w:top w:w="15" w:type="dxa"/>
+              <w:bottom w:w="15" w:type="dxa"/>
+              <w:left w:w="25" w:type="dxa"/>
+              <w:right w:w="25" w:type="dxa"/>
+            </w:tcMar>
+            <w:shd w:fill="E8F8F5"/>
+          </w:tcPr>
+          <w:p>
+            <w:pPr>
+              <w:jc w:val="center"/>
+            </w:pPr>
+            <w:r>
+              <w:rPr>
+                <w:b/>
+                <w:sz w:val="15"/>
+              </w:rPr>
+              <w:t>+4.66</w:t>
+            </w:r>
+          </w:p>
+        </w:tc>
+        <w:tc>
+          <w:tcPr>
+            <w:tcW w:type="dxa" w:w="1543"/>
+            <w:tcMar>
+              <w:top w:w="15" w:type="dxa"/>
+              <w:bottom w:w="15" w:type="dxa"/>
+              <w:left w:w="25" w:type="dxa"/>
+              <w:right w:w="25" w:type="dxa"/>
+            </w:tcMar>
+            <w:shd w:fill="E8F8F5"/>
+          </w:tcPr>
+          <w:p>
+            <w:pPr>
+              <w:jc w:val="center"/>
+            </w:pPr>
+            <w:r>
+              <w:rPr>
+                <w:b/>
+                <w:sz w:val="15"/>
+              </w:rPr>
+              <w:t>+7.66</w:t>
+            </w:r>
+          </w:p>
+        </w:tc>
+      </w:tr>
+    </w:tbl>
+    <w:p>
+      <w:pPr>
+        <w:spacing w:before="40" w:after="40"/>
+      </w:pPr>
+      <w:r>
+        <w:rPr>
+          <w:b/>
+          <w:color w:val="0E6655"/>
+          <w:sz w:val="16"/>
+        </w:rPr>
+        <w:t xml:space="preserve">⭐ En Yüksek Artış: Fen Bilimleri (+7.66 Net)  |  </w:t>
+      </w:r>
+      <w:r>
+        <w:rPr>
+          <w:b/>
+          <w:color w:val="B41414"/>
+          <w:sz w:val="16"/>
+        </w:rPr>
+        <w:t>⚠️ Takip / Müdahale Alanı: İnkılap Tarihi (-1.67 Net)</w:t>
+      </w:r>
+    </w:p>
+    <w:p>
+      <w:pPr>
+        <w:spacing w:before="60" w:after="20"/>
+      </w:pPr>
+      <w:r>
+        <w:rPr>
+          <w:b/>
+          <w:color w:val="006666"/>
           <w:sz w:val="18"/>
         </w:rPr>
-        <w:t>1. GENEL KAZANIM BAŞARI VE EKSİK ENVANTERİ</w:t>
+        <w:t>2. GENEL KAZANIM BAŞARI VE EKSİK ENVANTERİ</w:t>
       </w:r>
     </w:p>
     <w:p>
@@ -1557,7 +2739,7 @@
           <w:color w:val="B41414"/>
           <w:sz w:val="16"/>
         </w:rPr>
-        <w:t>Türkçe: Tablo ve Grafik Yorumlama, Türkçe: Soru-Cevap, Türkçe: Büyük Harflerin Kullanıldığı Yerler, Türkçe: Metin Tamamlama-Metin Oluşturma, Din Kültürü: 2. İnsanın İradesi ve Kader, Din Kültürü: 5. Bir Ayet Tanıyorum: Ayet El- Kürsi ve Anlamı, Din Kültürü: 4. Bir Peygamber Tanıyorum: Hz. Musa (A.S.), İngilizce: Making Simple Inquiries</w:t>
+        <w:t>Fen Bilimleri: DNA'nı Eşlenmesi</w:t>
       </w:r>
     </w:p>
     <w:p>
@@ -1576,7 +2758,7 @@
         <w:rPr>
           <w:sz w:val="16"/>
         </w:rPr>
-        <w:t>Matematik: Verilen Pozitif Tam Sayıların Pozitif Tam Sayı Çarpanlarını Bulur, Pozitif Tam Sayıların Pozitif Tam Sayı Çarpanlarını Üslü İfadelerin Çarpımı Şeklinde Yazar. (%25), Matematik: Üslü İfadelerle İlgili Temel Kuralları Anlar, Birbirine Denk İfadeler Oluşturur. (%25), Matematik: Verilen İki Doğal Sayının Aralarında Asal Olup Olmadığını Belirler. (%33), Fen Bilimleri: Mevsimlerin Oluşumu (%43)</w:t>
+        <w:t>Kritik eksik kazanım tespit edilmedi.</w:t>
       </w:r>
     </w:p>
     <w:p>
@@ -1609,7 +2791,7 @@
           <w:color w:val="1F497D"/>
           <w:sz w:val="18"/>
         </w:rPr>
-        <w:t>2. TÜM DERSLER İÇİN KİŞİSELLEŞTİRİLMİŞ BRANŞ GELİŞİM REÇETELERİ</w:t>
+        <w:t>3. TÜM DERSLER İÇİN KİŞİSELLEŞTİRİLMİŞ BRANŞ GELİŞİM REÇETELERİ</w:t>
       </w:r>
     </w:p>
     <w:tbl>
@@ -1659,7 +2841,7 @@
                 <w:color w:val="3C3C3C"/>
                 <w:sz w:val="15"/>
               </w:rPr>
-              <w:t>[Net: 9.67 | D: 12 | Y: 7 | B: 1 | Başarı: %48.4]</w:t>
+              <w:t>[Net: 17.33 | D: 18 | Y: 2 | B: 0 | Başarı: %86.6]</w:t>
             </w:r>
           </w:p>
         </w:tc>
@@ -1691,7 +2873,26 @@
               <w:rPr>
                 <w:sz w:val="15"/>
               </w:rPr>
-              <w:t>Mevsimlerin Oluşumu: %42.9 | İklim ve Hava Hareketleri: %100.0</w:t>
+              <w:t>Mevsimlerin Oluşumu: %90.0 | DNA ve Genetik Kod: %100.0 | İklim ve Hava Olayları: %100.0 | DNA ve Yapısı: %100.0 | DNA'nı Eşlenmesi: %0.0</w:t>
+            </w:r>
+          </w:p>
+          <w:p>
+            <w:pPr>
+              <w:spacing w:after="20"/>
+            </w:pPr>
+            <w:r>
+              <w:rPr>
+                <w:b/>
+                <w:color w:val="B41414"/>
+                <w:sz w:val="15"/>
+              </w:rPr>
+              <w:t xml:space="preserve">🔴 Sıfır Çekilen Kazanımlar (%0): </w:t>
+            </w:r>
+            <w:r>
+              <w:rPr>
+                <w:sz w:val="15"/>
+              </w:rPr>
+              <w:t>DNA'nı Eşlenmesi</w:t>
             </w:r>
           </w:p>
           <w:p>
@@ -1710,7 +2911,7 @@
               <w:rPr>
                 <w:sz w:val="15"/>
               </w:rPr>
-              <w:t>Mevsimlerin Oluşumu (%43)</w:t>
+              <w:t>Mevsimlerin Oluşumu (%90)</w:t>
             </w:r>
           </w:p>
           <w:p>
@@ -1729,7 +2930,7 @@
               <w:rPr>
                 <w:sz w:val="15"/>
               </w:rPr>
-              <w:t>Fen Bilimleri netin: 9.67 (12 Doğru, 7 Yanlış, 1 Boş). Sağlam bir altyapın var ancak 7 yanlış netini aşağı çekmiş. Özellikle 'Mevsimlerin Oluşumu' konusundaki (%43) 21 Haziran/21 Aralık gün dönümleri ve birim alana düşen enerji miktarı şemalarını 3D simülasyonla tekrar etmelisin. Deney sorularında bağımsız değişkeni kenara yaz; haftalık 45 fen sorusu çöz.</w:t>
+              <w:t>Fen Bilimleri netin: 17.33 (18 Doğru, 2 Yanlış, 0 Boş). Kavramsal kavrayışın ve deney yorumlama becerin çok yüksek. Tek hata yaptığın 'Mevsimlerin Oluşumu'ndaki (%90) eksen eğikliği ve Güneş ışınlarının geliş açısı grafiklerini pekiştirerek 20'de 20 full hedefini yakalayabilirsin.</w:t>
             </w:r>
           </w:p>
           <w:p>
@@ -1742,20 +2943,20 @@
                 <w:color w:val="C0392B"/>
                 <w:sz w:val="15"/>
               </w:rPr>
-              <w:t xml:space="preserve">📺 Önerilen YouTube Desteği (Orta Seviye): </w:t>
+              <w:t xml:space="preserve">📺 Önerilen YouTube Desteği (İleri Düzey (Şampiyon)): </w:t>
             </w:r>
             <w:r>
               <w:rPr>
                 <w:b/>
                 <w:sz w:val="15"/>
               </w:rPr>
-              <w:t xml:space="preserve">Kanal: Mehmet Hoca ile Fen | </w:t>
+              <w:t xml:space="preserve">Kanal: Hız Yayınları veya DNZ Hoca | </w:t>
             </w:r>
             <w:r>
               <w:rPr>
                 <w:sz w:val="15"/>
               </w:rPr>
-              <w:t>Odak: Kazanım Pekiştirme &amp; Deney Analizi. Taktik: Deney sorularındaki bağımsız/bağımlı/kontrol değişkeni çözüm adımlarını birebir uygula.</w:t>
+              <w:t>Odak: İleri Seviye Grafik &amp; Deney Yorumlama. Taktik: Karmaşık grafik ve çok adımlı deney sorularında hızlı yorumlama tekniklerini not al.</w:t>
             </w:r>
           </w:p>
         </w:tc>
@@ -1813,7 +3014,7 @@
                 <w:color w:val="3C3C3C"/>
                 <w:sz w:val="15"/>
               </w:rPr>
-              <w:t>[Net: 6.67 | D: 9 | Y: 7 | B: 4 | Başarı: %33.4]</w:t>
+              <w:t>[Net: 11.33 | D: 13 | Y: 5 | B: 2 | Başarı: %56.6]</w:t>
             </w:r>
           </w:p>
         </w:tc>
@@ -1845,7 +3046,7 @@
               <w:rPr>
                 <w:sz w:val="15"/>
               </w:rPr>
-              <w:t>Çarpanlar ve Katlar / Asal Çarpanlar: %25 | EBOB-EKOK Problemleri: %57 | Üslü İfadeler Temel Kuralları: %25 | Aralarında Asal Sayılar: %33 | Tam Sayı Kuvvetleri (Negatif Üs): %100</w:t>
+              <w:t>Çarpanlar ve Katlar: %71 | Ebob-Ekok Problemleri: %50 | Üslü İfadeler: %67</w:t>
             </w:r>
           </w:p>
           <w:p>
@@ -1864,7 +3065,7 @@
               <w:rPr>
                 <w:sz w:val="15"/>
               </w:rPr>
-              <w:t>Çarpanlar ve Katlar / Asal Çarpanlar (%25), EBOB-EKOK Problemleri (%57), Üslü İfadeler Temel Kuralları (%25), Aralarında Asal Sayılar (%33)</w:t>
+              <w:t>Çarpanlar ve Katlar (%71), Ebob-Ekok Problemleri (%50), Üslü İfadeler (%67)</w:t>
             </w:r>
           </w:p>
           <w:p>
@@ -1883,7 +3084,7 @@
               <w:rPr>
                 <w:sz w:val="15"/>
               </w:rPr>
-              <w:t>Matematik netin: 6.67 (9 Doğru, 7 Yanlış, 4 Boş). Temel matematik altyapın oluşmuş ancak 7 yanlış ve 4 boş puanını sınırlamış. Kritik açıkların olan [Çarpanlar ve Katlar / Asal Çarpanlar (%25), EBOB-EKOK Problemleri (%57), Üslü İfadeler Temel Kuralları (%25), Aralarında Asal Sayılar (%33)] konularında 'Verilenleri Yaz -&gt; Şemayı Çiz -&gt; Matematiksel Modeli Kur' 3 adımlı protokolünü uygula. Günde en az 20 adet yeni nesil soru çözerek işlem hızını artır.</w:t>
+              <w:t>Matematik netin: 11.33 (13 Doğru, 5 Yanlış, 2 Boş). Temel matematik altyapın oluşmuş ancak 5 yanlış ve 2 boş puanını sınırlamış. Kritik açıkların olan [Çarpanlar ve Katlar (%71), Ebob-Ekok Problemleri (%50), Üslü İfadeler (%67)] konularında 'Verilenleri Yaz -&gt; Şemayı Çiz -&gt; Matematiksel Modeli Kur' 3 adımlı protokolünü uygula. Günde en az 20 adet yeni nesil soru çözerek işlem hızını artır.</w:t>
             </w:r>
           </w:p>
           <w:p>
@@ -1896,20 +3097,20 @@
                 <w:color w:val="C0392B"/>
                 <w:sz w:val="15"/>
               </w:rPr>
-              <w:t xml:space="preserve">📺 Önerilen YouTube Desteği (Temel Seviye): </w:t>
+              <w:t xml:space="preserve">📺 Önerilen YouTube Desteği (Orta Seviye): </w:t>
             </w:r>
             <w:r>
               <w:rPr>
                 <w:b/>
                 <w:sz w:val="15"/>
               </w:rPr>
-              <w:t xml:space="preserve">Kanal: Partikül Matematik | </w:t>
+              <w:t xml:space="preserve">Kanal: İMT Hoca | </w:t>
             </w:r>
             <w:r>
               <w:rPr>
                 <w:sz w:val="15"/>
               </w:rPr>
-              <w:t>Odak: Temel Kavramlar &amp; Adım Adım Konu Anlatımı. Taktik: Videoyu durdurarak hocayla birlikte işlem yap; temel soru tiplerini not alıp kavrama testlerine geç.</w:t>
+              <w:t>Odak: Yeni Nesile Geçiş &amp; Soru Çözüm Taktikleri. Taktik: Yeni nesil sorularda verilenleri şemaya dökme ve matematiksel model kurma tekniklerine odaklan.</w:t>
             </w:r>
           </w:p>
         </w:tc>
@@ -1967,7 +3168,7 @@
                 <w:color w:val="3C3C3C"/>
                 <w:sz w:val="15"/>
               </w:rPr>
-              <w:t>[Net: 12.33 | D: 14 | Y: 5 | B: 1 | Başarı: %61.7]</w:t>
+              <w:t>[Net: 15.00 | D: 16 | Y: 3 | B: 1 | Başarı: %75.0]</w:t>
             </w:r>
           </w:p>
         </w:tc>
@@ -1999,26 +3200,7 @@
               <w:rPr>
                 <w:sz w:val="15"/>
               </w:rPr>
-              <w:t>11/16 Tam Başarı | Gelişim Alanları: Sözcük ve Sözcük Gruplarında Anlam: %50 | Tablo ve Grafik Yorumlama: %0 | Soru-Cevap: %0 | Büyük Harflerin Kullanıldığı Yerler: %0</w:t>
-            </w:r>
-          </w:p>
-          <w:p>
-            <w:pPr>
-              <w:spacing w:after="20"/>
-            </w:pPr>
-            <w:r>
-              <w:rPr>
-                <w:b/>
-                <w:color w:val="B41414"/>
-                <w:sz w:val="15"/>
-              </w:rPr>
-              <w:t xml:space="preserve">🔴 Sıfır Çekilen Kazanımlar (%0): </w:t>
-            </w:r>
-            <w:r>
-              <w:rPr>
-                <w:sz w:val="15"/>
-              </w:rPr>
-              <w:t>Tablo ve Grafik Yorumlama, Soru-Cevap, Büyük Harflerin Kullanıldığı Yerler, Metin Tamamlama-Metin Oluşturma</w:t>
+              <w:t>8/16 Tam Başarı | Gelişim Alanları: Sözcükte Anlam: %50 | Cümlede Anlam: %67 | Grafik ve Tablo Okuma: %50</w:t>
             </w:r>
           </w:p>
           <w:p>
@@ -2037,7 +3219,7 @@
               <w:rPr>
                 <w:sz w:val="15"/>
               </w:rPr>
-              <w:t>Sözcük ve Sözcük Gruplarında Anlam (%50)</w:t>
+              <w:t>Sözcükte Anlam (%50), Cümlede Anlam (%67), Grafik ve Tablo Okuma (%50)</w:t>
             </w:r>
           </w:p>
           <w:p>
@@ -2056,7 +3238,7 @@
               <w:rPr>
                 <w:sz w:val="15"/>
               </w:rPr>
-              <w:t>Türkçe branş netin: 12.33 (14 Doğru, 5 Yanlış, 1 Boş). Ortalama üstü bir performans olmakla birlikte 5 yanlış başarı payını törpülemiş. Öncelikli olarak sıfır çektiğin [Tablo ve Grafik Yorumlama, Soru-Cevap] konularındaki kavram ve kuralları tekrar et. Kısmi kayıp yaşadığın [Sözcük ve Sözcük Gruplarında Anlam (%50)] alanlarında metindeki açık kanıtın altını çizerek çöz. Günde 20 paragraf sorusu çöz; iki şık arasında kaldığında işaretleme yapmayıp boş bırak.</w:t>
+              <w:t>Türkçe branş netin: 15.00 (16 Doğru, 3 Yanlış, 1 Boş). Okuduğunu anlama, çıkarım ve muhakeme gücün çok yüksek. Kısmi kayıp yaşadığın [Sözcükte Anlam (%50), Cümlede Anlam (%67)] alanlarını gözden geçirerek 20'de 20 full hedefini yakala.</w:t>
             </w:r>
           </w:p>
           <w:p>
@@ -2069,20 +3251,20 @@
                 <w:color w:val="C0392B"/>
                 <w:sz w:val="15"/>
               </w:rPr>
-              <w:t xml:space="preserve">📺 Önerilen YouTube Desteği (Orta Seviye): </w:t>
+              <w:t xml:space="preserve">📺 Önerilen YouTube Desteği (İleri Düzey (Şampiyon)): </w:t>
             </w:r>
             <w:r>
               <w:rPr>
                 <w:b/>
                 <w:sz w:val="15"/>
               </w:rPr>
-              <w:t xml:space="preserve">Kanal: Hız Yayınları veya Ebubekir Hoca ile Türkçe | </w:t>
+              <w:t xml:space="preserve">Kanal: Hız Yayınları veya Ebubekir Hoca | </w:t>
             </w:r>
             <w:r>
               <w:rPr>
                 <w:sz w:val="15"/>
               </w:rPr>
-              <w:t>Odak: Paragraf Taktikleri &amp; Çeldirici Eleme. Taktik: Paragraf sorularında hocanın anahtar kelimeleri ve metin kanıtlarını nasıl çizdiğine dikkat et.</w:t>
+              <w:t>Odak: MEB Çıkmış &amp; Özgün Yeni Nesil Çözümleri. Taktik: İki güçlü çeldirici arasında kaldığında doğru seçeneğe götüren mantık ipuçlarını incele.</w:t>
             </w:r>
           </w:p>
         </w:tc>
@@ -2140,7 +3322,7 @@
                 <w:color w:val="3C3C3C"/>
                 <w:sz w:val="15"/>
               </w:rPr>
-              <w:t>[Net: 7.67 | D: 8 | Y: 1 | B: 1 | Başarı: %76.7]</w:t>
+              <w:t>[Net: 6.00 | D: 7 | Y: 3 | B: 0 | Başarı: %60.0]</w:t>
             </w:r>
           </w:p>
         </w:tc>
@@ -2172,7 +3354,7 @@
               <w:rPr>
                 <w:sz w:val="15"/>
               </w:rPr>
-              <w:t>Mustafa Kemal'in Öğrenim Hayatı: %100 | Uyanan Avrupa ve Sarsılan Osmanlı: %67 | Mustafa Kemal'in Fikir Hayatını Etkileyen Olaylar: %100 | Mustafa Kemal'in Askerlik Hayatı: %67</w:t>
+              <w:t>20. Yüzyıl Başlarında Osmanlı: %100 | M. Kemal'in Fikir Hayatını Etkileyen Olay ve Kişiler: %50 | M. Kemal'in Çocukluk Dönemi ve Öğrenim Hayatı: %67 | M. Kemal'İn Askerlik Hayatı: %50</w:t>
             </w:r>
           </w:p>
           <w:p>
@@ -2191,7 +3373,7 @@
               <w:rPr>
                 <w:sz w:val="15"/>
               </w:rPr>
-              <w:t>Uyanan Avrupa ve Sarsılan Osmanlı (%67), Mustafa Kemal'in Askerlik Hayatı (%67)</w:t>
+              <w:t>M. Kemal'in Fikir Hayatını Etkileyen Olay ve Kişiler (%50), M. Kemal'in Çocukluk Dönemi ve Öğrenim Hayatı (%67), M. Kemal'İn Askerlik Hayatı (%50)</w:t>
             </w:r>
           </w:p>
           <w:p>
@@ -2210,7 +3392,7 @@
               <w:rPr>
                 <w:sz w:val="15"/>
               </w:rPr>
-              <w:t>İnkılap Tarihi netin: 7.67 (8 Doğru, 1 Yanlış, 1 Boş). Hedeflenen seviyenin altında kalındı (7.67 Net). Pekiştirilmesi gereken [Uyanan Avrupa ve Sarsılan Osmanlı (%67), Mustafa Kemal'in Askerlik Hayatı (%67)] konularında kronoloji tablosu çıkar. Sorularda 'Yalnızca bu bilgiye göre' köklerine dikkat et; metne sadık kal. Haftalık 25 soru çöz.</w:t>
+              <w:t>İnkılap Tarihi netin: 6.00 (7 Doğru, 3 Yanlış, 0 Boş). Hedeflenen seviyenin altında kalındı (6.00 Net). Pekiştirilmesi gereken [M. Kemal'in Fikir Hayatını Etkileyen Olay ve Kişiler (%50), M. Kemal'in Çocukluk Dönemi ve Öğrenim Hayatı (%67), M. Kemal'İn Askerlik Hayatı (%50)] konularında kronoloji tablosu çıkar. Sorularda 'Yalnızca bu bilgiye göre' köklerine dikkat et; metne sadık kal. Haftalık 25 soru çöz.</w:t>
             </w:r>
           </w:p>
           <w:p>
@@ -2294,7 +3476,7 @@
                 <w:color w:val="3C3C3C"/>
                 <w:sz w:val="15"/>
               </w:rPr>
-              <w:t>[Net: 3.33 | D: 5 | Y: 5 | B: 0 | Başarı: %33.3]</w:t>
+              <w:t>[Net: 10.00 | D: 10 | Y: 0 | B: 0 | Başarı: %100.0]</w:t>
             </w:r>
           </w:p>
         </w:tc>
@@ -2326,45 +3508,7 @@
               <w:rPr>
                 <w:sz w:val="15"/>
               </w:rPr>
-              <w:t>Kader ve Kaza İnancı: %100 | İnsanın İradesi ve Kader: %0 | Kader Kavramları (Ömür, Ecel, Rızık, Tevekkül): %67 | Ayet el-Kürsi ve Anlamı: %0 | Hz. Musa (A.S.) ve Mücadelesi: %0</w:t>
-            </w:r>
-          </w:p>
-          <w:p>
-            <w:pPr>
-              <w:spacing w:after="20"/>
-            </w:pPr>
-            <w:r>
-              <w:rPr>
-                <w:b/>
-                <w:color w:val="B41414"/>
-                <w:sz w:val="15"/>
-              </w:rPr>
-              <w:t xml:space="preserve">🔴 Sıfır Çekilen Kazanımlar (%0): </w:t>
-            </w:r>
-            <w:r>
-              <w:rPr>
-                <w:sz w:val="15"/>
-              </w:rPr>
-              <w:t>İnsanın İradesi ve Kader, Ayet el-Kürsi ve Anlamı, Hz. Musa (A.S.) ve Mücadelesi</w:t>
-            </w:r>
-          </w:p>
-          <w:p>
-            <w:pPr>
-              <w:spacing w:after="20"/>
-            </w:pPr>
-            <w:r>
-              <w:rPr>
-                <w:b/>
-                <w:color w:val="B46400"/>
-                <w:sz w:val="15"/>
-              </w:rPr>
-              <w:t xml:space="preserve">🟡 Pekiştirilecek Kazanımlar (&lt;%100): </w:t>
-            </w:r>
-            <w:r>
-              <w:rPr>
-                <w:sz w:val="15"/>
-              </w:rPr>
-              <w:t>Kader Kavramları (Ömür, Ecel, Rızık, Tevekkül) (%67)</w:t>
+              <w:t>Kaza Ve Kader: %100 | İnsanın Özgürlüğü Ve Sorumluluğu: %100 | Kaderle İlgili Kavramlar: %100</w:t>
             </w:r>
           </w:p>
           <w:p>
@@ -2383,7 +3527,7 @@
               <w:rPr>
                 <w:sz w:val="15"/>
               </w:rPr>
-              <w:t>Din Kültürü netin: 3.33 (5 Doğru, 5 Yanlış, 0 Boş). Din Kültürü netin (3.33) potansiyelinin altında. Sıfır çektiğin [İnsanın İradesi ve Kader, Ayet el-Kürsi ve Anlamı, Hz. Musa (A.S.) ve Mücadelesi] konusunu mutlaka tekrar et. Kavram karmaşası yaşanan [Kader Kavramları (Ömür, Ecel, Rızık, Tevekkül) (%67)] alanlarına odaklan. Ömür, ecel, rızık, tevekkül, cüzi/külli irade kavramlarını sözlük kartlarına yazıp ezberle. Ayet-el Kürsi ana fikrine ve yasalara çalış.</w:t>
+              <w:t>Din Kültürü netin: 10.00 (10 Doğru, 0 Yanlış, 0 Boş). Kavram ve ayet yorumlama hakimiyetin yüksek. 5 kazanımın tamamında %100 tam başarı sağladın. Formunu haftalık 15 soruyla koru.</w:t>
             </w:r>
           </w:p>
           <w:p>
@@ -2396,7 +3540,7 @@
                 <w:color w:val="C0392B"/>
                 <w:sz w:val="15"/>
               </w:rPr>
-              <w:t xml:space="preserve">📺 Önerilen YouTube Desteği (Temel Seviye): </w:t>
+              <w:t xml:space="preserve">📺 Önerilen YouTube Desteği (İleri Düzey (Şampiyon)): </w:t>
             </w:r>
             <w:r>
               <w:rPr>
@@ -2409,7 +3553,7 @@
               <w:rPr>
                 <w:sz w:val="15"/>
               </w:rPr>
-              <w:t>Odak: Kaza-Kader Temel Kavramları &amp; Ayet Mealleri. Taktik: Ömür, ecel, rızık, tevekkül ve yasalar konusunu hocanın kavram tablolarından tekrar et.</w:t>
+              <w:t>Odak: 10'da 10 Hedefi &amp; Dikkat/Çeldirici Analizi. Taktik: Kelimelerin ince anlam farklarına dayalı soru kalıplarını yakalayarak full yapmayı hedefle.</w:t>
             </w:r>
           </w:p>
         </w:tc>
@@ -2467,7 +3611,7 @@
                 <w:color w:val="3C3C3C"/>
                 <w:sz w:val="15"/>
               </w:rPr>
-              <w:t>[Net: 4.67 | D: 6 | Y: 4 | B: 0 | Başarı: %46.7]</w:t>
+              <w:t>[Net: 7.33 | D: 8 | Y: 2 | B: 0 | Başarı: %73.3]</w:t>
             </w:r>
           </w:p>
         </w:tc>
@@ -2499,26 +3643,7 @@
               <w:rPr>
                 <w:sz w:val="15"/>
               </w:rPr>
-              <w:t>Davet Kartları / Mektupları (Invitation): %100 | Daveti Kabul &amp; Reddetme Kalıpları: %50 | Basit Sorular Sorma (Simple Inquiries): %0 | Friendship Okuduğunu Anlama: %100 | Kişisel Özellikler / Sıfatlar (Qualities): %67 | Mazeret Bildirme ve Özür Dileme: %100</w:t>
-            </w:r>
-          </w:p>
-          <w:p>
-            <w:pPr>
-              <w:spacing w:after="20"/>
-            </w:pPr>
-            <w:r>
-              <w:rPr>
-                <w:b/>
-                <w:color w:val="B41414"/>
-                <w:sz w:val="15"/>
-              </w:rPr>
-              <w:t xml:space="preserve">🔴 Sıfır Çekilen Kazanımlar (%0): </w:t>
-            </w:r>
-            <w:r>
-              <w:rPr>
-                <w:sz w:val="15"/>
-              </w:rPr>
-              <w:t>Basit Sorular Sorma (Simple Inquiries)</w:t>
+              <w:t>Teklif Yapma, Kabul Etme, Özür Dileme: %100 | Frıendshıp: %50 | The Internet: %100 | Tercihleri İfade Etme: %100 | Soru Cümlesi: %100</w:t>
             </w:r>
           </w:p>
           <w:p>
@@ -2537,7 +3662,7 @@
               <w:rPr>
                 <w:sz w:val="15"/>
               </w:rPr>
-              <w:t>Daveti Kabul &amp; Reddetme Kalıpları (%50), Kişisel Özellikler / Sıfatlar (Qualities) (%67)</w:t>
+              <w:t>Frıendshıp (%50)</w:t>
             </w:r>
           </w:p>
           <w:p>
@@ -2556,7 +3681,7 @@
               <w:rPr>
                 <w:sz w:val="15"/>
               </w:rPr>
-              <w:t>İngilizce branş netin: 4.67 (6 Doğru, 4 Yanlış, 0 Boş). İngilizce branşında 4.67 net ile hedefin gerisinde kalındı. Sıfır çektiğin [Basit Sorular Sorma (Simple Inquiries)] soru kalıplarını tekrar et. Pekiştirilmesi gereken [Daveti Kabul &amp; Reddetme Kalıpları (%50), Kişisel Özellikler / Sıfatlar (Qualities) (%67)] kalıplarını çalış. Davet etme (Would you like...), kabul/ret ve mazeret kalıplarını ve Friendship sıfatlarını her gün 5 kelime kartıyla çalış. Rastgele işaretleme yapma.</w:t>
+              <w:t>İngilizce branş netin: 7.33 (8 Doğru, 2 Yanlış, 0 Boş). İngilizce branşında 7.33 net ile hedefin gerisinde kalındı. Pekiştirilmesi gereken [Frıendshıp (%50)] kalıplarını çalış. Davet etme (Would you like...), kabul/ret ve mazeret kalıplarını ve Friendship sıfatlarını her gün 5 kelime kartıyla çalış. Rastgele işaretleme yapma.</w:t>
             </w:r>
           </w:p>
           <w:p>
@@ -2569,20 +3694,20 @@
                 <w:color w:val="C0392B"/>
                 <w:sz w:val="15"/>
               </w:rPr>
-              <w:t xml:space="preserve">📺 Önerilen YouTube Desteği (Temel Seviye): </w:t>
+              <w:t xml:space="preserve">📺 Önerilen YouTube Desteği (Orta Seviye): </w:t>
             </w:r>
             <w:r>
               <w:rPr>
                 <w:b/>
                 <w:sz w:val="15"/>
               </w:rPr>
-              <w:t xml:space="preserve">Kanal: Tonguç Akademi | </w:t>
+              <w:t xml:space="preserve">Kanal: Dilek Demirel | </w:t>
             </w:r>
             <w:r>
               <w:rPr>
                 <w:sz w:val="15"/>
               </w:rPr>
-              <w:t>Odak: Temel Kelimeler &amp; Kalıp Cümleler. Taktik: Friendship ünitesi kelimelerini ve Türkçelerini sesli tekrar ederek kelime defterine geçir.</w:t>
+              <w:t>Odak: Diyalog Tamamlama &amp; Soru Çözüm Metotları. Taktik: Davet, kabul, ret ve mazeret cümlelerini diyalog içi bağlamıyla öğren.</w:t>
             </w:r>
           </w:p>
         </w:tc>
@@ -2603,7 +3728,7 @@
           <w:color w:val="006666"/>
           <w:sz w:val="18"/>
         </w:rPr>
-        <w:t>3. KİŞİSELLEŞTİRİLMİŞ HEDEFLER VE EYLEM TAKVİMİ</w:t>
+        <w:t>4. KİŞİSELLEŞTİRİLMİŞ HEDEFLER VE EYLEM TAKVİMİ</w:t>
       </w:r>
     </w:p>
     <w:p>
@@ -2622,7 +3747,7 @@
         <w:rPr>
           <w:sz w:val="16"/>
         </w:rPr>
-        <w:t>48.34 Net (İlk hedefli konu tekrarları ve ödev kontrolü sonrası)</w:t>
+        <w:t>70.49 Net (İlk hedefli konu tekrarları ve ödev kontrolü sonrası)</w:t>
       </w:r>
     </w:p>
     <w:p>
@@ -2641,7 +3766,7 @@
         <w:rPr>
           <w:sz w:val="16"/>
         </w:rPr>
-        <w:t>52.34 Net (Ölçülebilir bir sonraki resmi deneme sınavı hedefi)</w:t>
+        <w:t>73.99 Net (Ölçülebilir bir sonraki resmi deneme sınavı hedefi)</w:t>
       </w:r>
     </w:p>
     <w:p>
@@ -2660,7 +3785,7 @@
         <w:rPr>
           <w:sz w:val="16"/>
         </w:rPr>
-        <w:t>Haftalık 350 soru çözümü + Yanlış Defteri (Hata Analizi) tutulması ve kontrolü.</w:t>
+        <w:t>Haftalık 400 soru çözümü + Yanlış Defteri (Hata Analizi) tutulması ve kontrolü.</w:t>
       </w:r>
     </w:p>
     <w:p>
@@ -2679,7 +3804,7 @@
         <w:rPr>
           <w:sz w:val="16"/>
         </w:rPr>
-        <w:t>Matematik temel/orta seviye problem çözümü + Türkçe paragraf.</w:t>
+        <w:t>Matematik yeni nesil problem modelleme ve süre tutma.</w:t>
       </w:r>
     </w:p>
     <w:p>

</xml_diff>